<commit_message>
Linda Bushel: Joel's final decisions — 125 h at $75, Vista additional, 11 Pro Post piles supply and install
Direct $25,652.58; selling $30,179.51; HST $3,923.34; total $34,102.85. Masters 01-03 repopulated.
Quote status flagged: BMR expires 28 Oct; Pro Post quote expired 21 Oct.

Co-Authored-By: Claude Opus 5.5 <noreply@anthropic.com>
Claude-Session: https://claude.ai/code/session_01Gt3yQsGEScje26ZopVkG3s
</commit_message>
<xml_diff>
--- a/docs/estimating-cases/2026/linda-bushel-pool-deck/estimates/customer/2026-10-27-linda-bushel-03-customer-facing-estimate.docx
+++ b/docs/estimating-cases/2026/linda-bushel-pool-deck/estimates/customer/2026-10-27-linda-bushel-03-customer-facing-estimate.docx
@@ -156,7 +156,7 @@
           <w:color w:val="C69A2B"/>
           <w:sz w:val="40"/>
         </w:rPr>
-        <w:t>$30,267.74 + HST</w:t>
+        <w:t>$30,179.51 + HST</w:t>
       </w:r>
     </w:p>
     <w:p>
@@ -168,7 +168,7 @@
           <w:b/>
           <w:sz w:val="24"/>
         </w:rPr>
-        <w:t>Total including HST: $34,202.55</w:t>
+        <w:t>Total including HST: $34,102.85</w:t>
       </w:r>
     </w:p>
     <w:p>
@@ -700,7 +700,7 @@
               <w:rPr>
                 <w:sz w:val="16"/>
               </w:rPr>
-              <w:t>$30,267.74</w:t>
+              <w:t>$30,179.51</w:t>
             </w:r>
           </w:p>
         </w:tc>
@@ -740,7 +740,7 @@
               <w:rPr>
                 <w:sz w:val="16"/>
               </w:rPr>
-              <w:t>$3,934.81</w:t>
+              <w:t>$3,923.34</w:t>
             </w:r>
           </w:p>
         </w:tc>
@@ -780,7 +780,7 @@
               <w:rPr>
                 <w:sz w:val="16"/>
               </w:rPr>
-              <w:t>$34,202.55</w:t>
+              <w:t>$34,102.85</w:t>
             </w:r>
           </w:p>
         </w:tc>

</xml_diff>

<commit_message>
Linda Bushel: 12.5% true gross margin (Ben's project decision); Master 08 Customer Detailed Cost Estimate
Direct $25,652.58; selling $29,317.23; gross profit $3,664.65; HST $3,811.24; total $33,128.47.
Customer detail: each line / 0.875, materials and foundation $18,602.94 + labour $10,714.29, no rounding residual.
15% Word PDFs withdrawn until the revised DOCX files are exported.

Co-Authored-By: Claude Opus 5.5 <noreply@anthropic.com>
Claude-Session: https://claude.ai/code/session_01Gt3yQsGEScje26ZopVkG3s
</commit_message>
<xml_diff>
--- a/docs/estimating-cases/2026/linda-bushel-pool-deck/estimates/customer/2026-10-27-linda-bushel-03-customer-facing-estimate.docx
+++ b/docs/estimating-cases/2026/linda-bushel-pool-deck/estimates/customer/2026-10-27-linda-bushel-03-customer-facing-estimate.docx
@@ -156,7 +156,7 @@
           <w:color w:val="C69A2B"/>
           <w:sz w:val="40"/>
         </w:rPr>
-        <w:t>$30,179.51 + HST</w:t>
+        <w:t>$29,317.23 + HST</w:t>
       </w:r>
     </w:p>
     <w:p>
@@ -168,7 +168,7 @@
           <w:b/>
           <w:sz w:val="24"/>
         </w:rPr>
-        <w:t>Total including HST: $34,102.85</w:t>
+        <w:t>Total including HST: $33,128.47</w:t>
       </w:r>
     </w:p>
     <w:p>
@@ -700,7 +700,7 @@
               <w:rPr>
                 <w:sz w:val="16"/>
               </w:rPr>
-              <w:t>$30,179.51</w:t>
+              <w:t>$29,317.23</w:t>
             </w:r>
           </w:p>
         </w:tc>
@@ -740,7 +740,7 @@
               <w:rPr>
                 <w:sz w:val="16"/>
               </w:rPr>
-              <w:t>$3,923.34</w:t>
+              <w:t>$3,811.24</w:t>
             </w:r>
           </w:p>
         </w:tc>
@@ -780,7 +780,7 @@
               <w:rPr>
                 <w:sz w:val="16"/>
               </w:rPr>
-              <w:t>$34,102.85</w:t>
+              <w:t>$33,128.47</w:t>
             </w:r>
           </w:p>
         </w:tc>

</xml_diff>